<commit_message>
docs(cv): add selected projects with scope and tech stacks
Dhaka Wholesale, PostPilot, VibeFlow and SOFOL, each with a live/source
link, two impact bullets and a tech line matching the portfolio's flagship
project cards.

Co-Authored-By: Claude Opus 5.5 <noreply@anthropic.com>
</commit_message>
<xml_diff>
--- a/CV/Atik_Shahriar_CV.docx
+++ b/CV/Atik_Shahriar_CV.docx
@@ -730,6 +730,485 @@
           <w:color w:val="1E4E8C"/>
           <w:sz w:val="22"/>
         </w:rPr>
+        <w:t>SELECTED PROJECTS</w:t>
+      </w:r>
+    </w:p>
+    <w:p>
+      <w:pPr>
+        <w:keepNext/>
+        <w:tabs>
+          <w:tab w:pos="10091" w:val="right"/>
+        </w:tabs>
+        <w:spacing w:before="80" w:after="0"/>
+      </w:pPr>
+      <w:r>
+        <w:rPr>
+          <w:b/>
+          <w:i w:val="0"/>
+          <w:sz w:val="22"/>
+        </w:rPr>
+        <w:t>Dhaka Wholesale</w:t>
+      </w:r>
+      <w:r>
+        <w:rPr>
+          <w:b w:val="0"/>
+          <w:i w:val="0"/>
+          <w:color w:val="555D6B"/>
+          <w:sz w:val="19"/>
+        </w:rPr>
+        <w:t xml:space="preserve">  |  </w:t>
+      </w:r>
+      <w:hyperlink r:id="rId16">
+        <w:r>
+          <w:rPr>
+            <w:rFonts w:ascii="Calibri" w:hAnsi="Calibri" w:cs="Calibri"/>
+            <w:color w:val="1E4E8C"/>
+            <w:sz w:val="19"/>
+          </w:rPr>
+          <w:t xml:space="preserve">dhakawholesale.com</w:t>
+        </w:r>
+      </w:hyperlink>
+      <w:r>
+        <w:rPr>
+          <w:b w:val="0"/>
+          <w:i w:val="0"/>
+          <w:color w:val="555D6B"/>
+          <w:sz w:val="19"/>
+        </w:rPr>
+        <w:tab/>
+        <w:t>Production</w:t>
+      </w:r>
+    </w:p>
+    <w:p>
+      <w:pPr>
+        <w:tabs>
+          <w:tab w:pos="255" w:val="left"/>
+        </w:tabs>
+        <w:spacing w:before="0" w:after="20"/>
+        <w:ind w:left="255" w:hanging="198"/>
+      </w:pPr>
+      <w:r>
+        <w:rPr>
+          <w:b w:val="0"/>
+          <w:i w:val="0"/>
+          <w:color w:val="1E4E8C"/>
+        </w:rPr>
+        <w:t>•</w:t>
+        <w:tab/>
+      </w:r>
+      <w:r>
+        <w:rPr>
+          <w:b w:val="0"/>
+          <w:i w:val="0"/>
+        </w:rPr>
+        <w:t>Live storefront and admin platform for a Dhaka wholesale business: catalog, cart, checkout, orders, wishlist and reviews, with live order updates on the admin dashboard.</w:t>
+      </w:r>
+    </w:p>
+    <w:p>
+      <w:pPr>
+        <w:tabs>
+          <w:tab w:pos="255" w:val="left"/>
+        </w:tabs>
+        <w:spacing w:before="0" w:after="20"/>
+        <w:ind w:left="255" w:hanging="198"/>
+      </w:pPr>
+      <w:r>
+        <w:rPr>
+          <w:b w:val="0"/>
+          <w:i w:val="0"/>
+          <w:color w:val="1E4E8C"/>
+        </w:rPr>
+        <w:t>•</w:t>
+        <w:tab/>
+      </w:r>
+      <w:r>
+        <w:rPr>
+          <w:b w:val="0"/>
+          <w:i w:val="0"/>
+        </w:rPr>
+        <w:t>Next.js 16 App Router with ISR catalog pages; NestJS 11 REST API hardened with Zod validation, Helmet, compression and rate limiting; Supabase Postgres, JWT and Realtime.</w:t>
+      </w:r>
+    </w:p>
+    <w:p>
+      <w:pPr>
+        <w:spacing w:before="0" w:after="20"/>
+        <w:ind w:left="255"/>
+      </w:pPr>
+      <w:r>
+        <w:rPr>
+          <w:b/>
+          <w:i w:val="0"/>
+          <w:color w:val="555D6B"/>
+          <w:sz w:val="19"/>
+        </w:rPr>
+        <w:t xml:space="preserve">Tech: </w:t>
+      </w:r>
+      <w:r>
+        <w:rPr>
+          <w:b w:val="0"/>
+          <w:i w:val="0"/>
+          <w:color w:val="555D6B"/>
+          <w:sz w:val="19"/>
+        </w:rPr>
+        <w:t>Next.js 16 · React 19 · NestJS · TypeScript · Supabase · Zustand · SWR</w:t>
+      </w:r>
+    </w:p>
+    <w:p>
+      <w:pPr>
+        <w:keepNext/>
+        <w:tabs>
+          <w:tab w:pos="10091" w:val="right"/>
+        </w:tabs>
+        <w:spacing w:before="80" w:after="0"/>
+      </w:pPr>
+      <w:r>
+        <w:rPr>
+          <w:b/>
+          <w:i w:val="0"/>
+          <w:sz w:val="22"/>
+        </w:rPr>
+        <w:t>PostPilot</w:t>
+      </w:r>
+      <w:r>
+        <w:rPr>
+          <w:b w:val="0"/>
+          <w:i w:val="0"/>
+          <w:color w:val="555D6B"/>
+          <w:sz w:val="19"/>
+        </w:rPr>
+        <w:tab/>
+        <w:t>AI SaaS</w:t>
+      </w:r>
+    </w:p>
+    <w:p>
+      <w:pPr>
+        <w:tabs>
+          <w:tab w:pos="255" w:val="left"/>
+        </w:tabs>
+        <w:spacing w:before="0" w:after="20"/>
+        <w:ind w:left="255" w:hanging="198"/>
+      </w:pPr>
+      <w:r>
+        <w:rPr>
+          <w:b w:val="0"/>
+          <w:i w:val="0"/>
+          <w:color w:val="1E4E8C"/>
+        </w:rPr>
+        <w:t>•</w:t>
+        <w:tab/>
+      </w:r>
+      <w:r>
+        <w:rPr>
+          <w:b w:val="0"/>
+          <w:i w:val="0"/>
+        </w:rPr>
+        <w:t>AI-powered social publishing SaaS: write a post once, then adapt, schedule and publish it to every connected platform.</w:t>
+      </w:r>
+    </w:p>
+    <w:p>
+      <w:pPr>
+        <w:tabs>
+          <w:tab w:pos="255" w:val="left"/>
+        </w:tabs>
+        <w:spacing w:before="0" w:after="20"/>
+        <w:ind w:left="255" w:hanging="198"/>
+      </w:pPr>
+      <w:r>
+        <w:rPr>
+          <w:b w:val="0"/>
+          <w:i w:val="0"/>
+          <w:color w:val="1E4E8C"/>
+        </w:rPr>
+        <w:t>•</w:t>
+        <w:tab/>
+      </w:r>
+      <w:r>
+        <w:rPr>
+          <w:b w:val="0"/>
+          <w:i w:val="0"/>
+        </w:rPr>
+        <w:t>Provider-agnostic AI layer (Anthropic and OpenAI) and a database-backed publishing queue with retries, exponential backoff and idempotency; Supabase RLS, encrypted platform tokens and Zod at every boundary.</w:t>
+      </w:r>
+    </w:p>
+    <w:p>
+      <w:pPr>
+        <w:spacing w:before="0" w:after="20"/>
+        <w:ind w:left="255"/>
+      </w:pPr>
+      <w:r>
+        <w:rPr>
+          <w:b/>
+          <w:i w:val="0"/>
+          <w:color w:val="555D6B"/>
+          <w:sz w:val="19"/>
+        </w:rPr>
+        <w:t xml:space="preserve">Tech: </w:t>
+      </w:r>
+      <w:r>
+        <w:rPr>
+          <w:b w:val="0"/>
+          <w:i w:val="0"/>
+          <w:color w:val="555D6B"/>
+          <w:sz w:val="19"/>
+        </w:rPr>
+        <w:t>Next.js 16 · React 19 · Supabase · TanStack Query · Zod · Vitest</w:t>
+      </w:r>
+    </w:p>
+    <w:p>
+      <w:pPr>
+        <w:keepNext/>
+        <w:tabs>
+          <w:tab w:pos="10091" w:val="right"/>
+        </w:tabs>
+        <w:spacing w:before="80" w:after="0"/>
+      </w:pPr>
+      <w:r>
+        <w:rPr>
+          <w:b/>
+          <w:i w:val="0"/>
+          <w:sz w:val="22"/>
+        </w:rPr>
+        <w:t>VibeFlow</w:t>
+      </w:r>
+      <w:r>
+        <w:rPr>
+          <w:b w:val="0"/>
+          <w:i w:val="0"/>
+          <w:color w:val="555D6B"/>
+          <w:sz w:val="19"/>
+        </w:rPr>
+        <w:t xml:space="preserve">  |  </w:t>
+      </w:r>
+      <w:hyperlink r:id="rId17">
+        <w:r>
+          <w:rPr>
+            <w:rFonts w:ascii="Calibri" w:hAnsi="Calibri" w:cs="Calibri"/>
+            <w:color w:val="1E4E8C"/>
+            <w:sz w:val="19"/>
+          </w:rPr>
+          <w:t xml:space="preserve">vibeflow.tech</w:t>
+        </w:r>
+      </w:hyperlink>
+      <w:r>
+        <w:rPr>
+          <w:b w:val="0"/>
+          <w:i w:val="0"/>
+          <w:color w:val="555D6B"/>
+          <w:sz w:val="19"/>
+        </w:rPr>
+        <w:tab/>
+        <w:t>SaaS platform</w:t>
+      </w:r>
+    </w:p>
+    <w:p>
+      <w:pPr>
+        <w:tabs>
+          <w:tab w:pos="255" w:val="left"/>
+        </w:tabs>
+        <w:spacing w:before="0" w:after="20"/>
+        <w:ind w:left="255" w:hanging="198"/>
+      </w:pPr>
+      <w:r>
+        <w:rPr>
+          <w:b w:val="0"/>
+          <w:i w:val="0"/>
+          <w:color w:val="1E4E8C"/>
+        </w:rPr>
+        <w:t>•</w:t>
+        <w:tab/>
+      </w:r>
+      <w:r>
+        <w:rPr>
+          <w:b w:val="0"/>
+          <w:i w:val="0"/>
+        </w:rPr>
+        <w:t>Software-studio platform where clients submit a request and track it to delivery, with a client portal, admin console and real-time notifications on Supabase.</w:t>
+      </w:r>
+    </w:p>
+    <w:p>
+      <w:pPr>
+        <w:tabs>
+          <w:tab w:pos="255" w:val="left"/>
+        </w:tabs>
+        <w:spacing w:before="0" w:after="20"/>
+        <w:ind w:left="255" w:hanging="198"/>
+      </w:pPr>
+      <w:r>
+        <w:rPr>
+          <w:b w:val="0"/>
+          <w:i w:val="0"/>
+          <w:color w:val="1E4E8C"/>
+        </w:rPr>
+        <w:t>•</w:t>
+        <w:tab/>
+      </w:r>
+      <w:r>
+        <w:rPr>
+          <w:b w:val="0"/>
+          <w:i w:val="0"/>
+        </w:rPr>
+        <w:t>Build-time prerendering, generated sitemaps and analytics for SEO; hosts the AgentDeck download/update site and playable projects such as Back Bencher.</w:t>
+      </w:r>
+    </w:p>
+    <w:p>
+      <w:pPr>
+        <w:spacing w:before="0" w:after="20"/>
+        <w:ind w:left="255"/>
+      </w:pPr>
+      <w:r>
+        <w:rPr>
+          <w:b/>
+          <w:i w:val="0"/>
+          <w:color w:val="555D6B"/>
+          <w:sz w:val="19"/>
+        </w:rPr>
+        <w:t xml:space="preserve">Tech: </w:t>
+      </w:r>
+      <w:r>
+        <w:rPr>
+          <w:b w:val="0"/>
+          <w:i w:val="0"/>
+          <w:color w:val="555D6B"/>
+          <w:sz w:val="19"/>
+        </w:rPr>
+        <w:t>React · Vite · Supabase · Vercel</w:t>
+      </w:r>
+    </w:p>
+    <w:p>
+      <w:pPr>
+        <w:keepNext/>
+        <w:tabs>
+          <w:tab w:pos="10091" w:val="right"/>
+        </w:tabs>
+        <w:spacing w:before="80" w:after="0"/>
+      </w:pPr>
+      <w:r>
+        <w:rPr>
+          <w:b/>
+          <w:i w:val="0"/>
+          <w:sz w:val="22"/>
+        </w:rPr>
+        <w:t>SOFOL — Farmer Credit-Profile Fintech App</w:t>
+      </w:r>
+      <w:r>
+        <w:rPr>
+          <w:b w:val="0"/>
+          <w:i w:val="0"/>
+          <w:color w:val="555D6B"/>
+          <w:sz w:val="19"/>
+        </w:rPr>
+        <w:t xml:space="preserve">  |  </w:t>
+      </w:r>
+      <w:hyperlink r:id="rId18">
+        <w:r>
+          <w:rPr>
+            <w:rFonts w:ascii="Calibri" w:hAnsi="Calibri" w:cs="Calibri"/>
+            <w:color w:val="1E4E8C"/>
+            <w:sz w:val="19"/>
+          </w:rPr>
+          <w:t xml:space="preserve">GitHub</w:t>
+        </w:r>
+      </w:hyperlink>
+      <w:r>
+        <w:rPr>
+          <w:b w:val="0"/>
+          <w:i w:val="0"/>
+          <w:color w:val="555D6B"/>
+          <w:sz w:val="19"/>
+        </w:rPr>
+        <w:tab/>
+        <w:t>AIUB final project</w:t>
+      </w:r>
+    </w:p>
+    <w:p>
+      <w:pPr>
+        <w:tabs>
+          <w:tab w:pos="255" w:val="left"/>
+        </w:tabs>
+        <w:spacing w:before="0" w:after="20"/>
+        <w:ind w:left="255" w:hanging="198"/>
+      </w:pPr>
+      <w:r>
+        <w:rPr>
+          <w:b w:val="0"/>
+          <w:i w:val="0"/>
+          <w:color w:val="1E4E8C"/>
+        </w:rPr>
+        <w:t>•</w:t>
+        <w:tab/>
+      </w:r>
+      <w:r>
+        <w:rPr>
+          <w:b w:val="0"/>
+          <w:i w:val="0"/>
+        </w:rPr>
+        <w:t>React Native (Expo Router) app and Express 5 + TypeScript API that lets farmers build a digital credit history, record transactions and apply for loans.</w:t>
+      </w:r>
+    </w:p>
+    <w:p>
+      <w:pPr>
+        <w:tabs>
+          <w:tab w:pos="255" w:val="left"/>
+        </w:tabs>
+        <w:spacing w:before="0" w:after="20"/>
+        <w:ind w:left="255" w:hanging="198"/>
+      </w:pPr>
+      <w:r>
+        <w:rPr>
+          <w:b w:val="0"/>
+          <w:i w:val="0"/>
+          <w:color w:val="1E4E8C"/>
+        </w:rPr>
+        <w:t>•</w:t>
+        <w:tab/>
+      </w:r>
+      <w:r>
+        <w:rPr>
+          <w:b w:val="0"/>
+          <w:i w:val="0"/>
+        </w:rPr>
+        <w:t>Separate dashboards for Admin, Bank Officer and Field Officer roles behind per-role guards, Helmet, a CORS allow-list and rate limiting; Supabase PostgreSQL schema for loans, verification and field visits.</w:t>
+      </w:r>
+    </w:p>
+    <w:p>
+      <w:pPr>
+        <w:spacing w:before="0" w:after="20"/>
+        <w:ind w:left="255"/>
+      </w:pPr>
+      <w:r>
+        <w:rPr>
+          <w:b/>
+          <w:i w:val="0"/>
+          <w:color w:val="555D6B"/>
+          <w:sz w:val="19"/>
+        </w:rPr>
+        <w:t xml:space="preserve">Tech: </w:t>
+      </w:r>
+      <w:r>
+        <w:rPr>
+          <w:b w:val="0"/>
+          <w:i w:val="0"/>
+          <w:color w:val="555D6B"/>
+          <w:sz w:val="19"/>
+        </w:rPr>
+        <w:t>React Native · Expo · Express 5 · TypeScript · Supabase</w:t>
+      </w:r>
+    </w:p>
+    <w:p>
+      <w:pPr>
+        <w:keepNext/>
+        <w:spacing w:before="200" w:after="60"/>
+        <w:pBdr>
+          <w:bottom w:val="single" w:sz="6" w:space="1" w:color="1E4E8C"/>
+        </w:pBdr>
+      </w:pPr>
+      <w:r>
+        <w:rPr>
+          <w:b/>
+          <w:i w:val="0"/>
+          <w:color w:val="1E4E8C"/>
+          <w:sz w:val="22"/>
+        </w:rPr>
         <w:t>HACKATHONS &amp; COMPETITIONS</w:t>
       </w:r>
     </w:p>

</xml_diff>

<commit_message>
docs(cv): add experience, hackathons and robotics achievements
Adds AgentDeck (creator & lead developer, 2026-present) and freelance
full-stack work (2023-present), plus SUST CSE Carnival 2026, IUT Hackathon,
NSU Tech Fest and the National Robotics Championship, all taken from the
portfolio's Journey section. Education gains coursework and the SOFOL
final project.

Co-Authored-By: Claude Opus 5.5 <noreply@anthropic.com>
</commit_message>
<xml_diff>
--- a/CV/Atik_Shahriar_CV.docx
+++ b/CV/Atik_Shahriar_CV.docx
@@ -380,6 +380,549 @@
           <w:color w:val="1E4E8C"/>
           <w:sz w:val="22"/>
         </w:rPr>
+        <w:t>EXPERIENCE</w:t>
+      </w:r>
+    </w:p>
+    <w:p>
+      <w:pPr>
+        <w:keepNext/>
+        <w:tabs>
+          <w:tab w:pos="10091" w:val="right"/>
+        </w:tabs>
+        <w:spacing w:before="80" w:after="0"/>
+      </w:pPr>
+      <w:r>
+        <w:rPr>
+          <w:b/>
+          <w:i w:val="0"/>
+          <w:sz w:val="22"/>
+        </w:rPr>
+        <w:t>Creator &amp; Lead Developer — AgentDeck</w:t>
+      </w:r>
+      <w:r>
+        <w:rPr>
+          <w:b w:val="0"/>
+          <w:i w:val="0"/>
+          <w:color w:val="555D6B"/>
+          <w:sz w:val="19"/>
+        </w:rPr>
+        <w:t xml:space="preserve">  |  </w:t>
+      </w:r>
+      <w:hyperlink r:id="rId15">
+        <w:r>
+          <w:rPr>
+            <w:rFonts w:ascii="Calibri" w:hAnsi="Calibri" w:cs="Calibri"/>
+            <w:color w:val="1E4E8C"/>
+            <w:sz w:val="19"/>
+          </w:rPr>
+          <w:t xml:space="preserve">vibeflow.tech/agentdeck</w:t>
+        </w:r>
+      </w:hyperlink>
+      <w:r>
+        <w:rPr>
+          <w:b w:val="0"/>
+          <w:i w:val="0"/>
+          <w:color w:val="555D6B"/>
+          <w:sz w:val="19"/>
+        </w:rPr>
+        <w:tab/>
+        <w:t>2026 – Present</w:t>
+      </w:r>
+    </w:p>
+    <w:p>
+      <w:pPr>
+        <w:keepNext/>
+        <w:tabs>
+          <w:tab w:pos="10091" w:val="right"/>
+        </w:tabs>
+        <w:spacing w:before="0" w:after="20"/>
+      </w:pPr>
+      <w:r>
+        <w:rPr>
+          <w:b w:val="0"/>
+          <w:i/>
+          <w:color w:val="555D6B"/>
+          <w:sz w:val="20"/>
+        </w:rPr>
+        <w:t>Desktop workspace for AI coding agents  ·  Windows, macOS &amp; Linux</w:t>
+      </w:r>
+    </w:p>
+    <w:p>
+      <w:pPr>
+        <w:tabs>
+          <w:tab w:pos="255" w:val="left"/>
+        </w:tabs>
+        <w:spacing w:before="0" w:after="20"/>
+        <w:ind w:left="255" w:hanging="198"/>
+      </w:pPr>
+      <w:r>
+        <w:rPr>
+          <w:b w:val="0"/>
+          <w:i w:val="0"/>
+          <w:color w:val="1E4E8C"/>
+        </w:rPr>
+        <w:t>•</w:t>
+        <w:tab/>
+      </w:r>
+      <w:r>
+        <w:rPr>
+          <w:b w:val="0"/>
+          <w:i w:val="0"/>
+        </w:rPr>
+        <w:t>Designed and shipped a Python/PySide6 app that runs Claude, Codex, Copilot, Gemini and other coding agents side by side in real terminal panes, showing which agent is working, idle or waiting for input.</w:t>
+      </w:r>
+    </w:p>
+    <w:p>
+      <w:pPr>
+        <w:tabs>
+          <w:tab w:pos="255" w:val="left"/>
+        </w:tabs>
+        <w:spacing w:before="0" w:after="20"/>
+        <w:ind w:left="255" w:hanging="198"/>
+      </w:pPr>
+      <w:r>
+        <w:rPr>
+          <w:b w:val="0"/>
+          <w:i w:val="0"/>
+          <w:color w:val="1E4E8C"/>
+        </w:rPr>
+        <w:t>•</w:t>
+        <w:tab/>
+      </w:r>
+      <w:r>
+        <w:rPr>
+          <w:b w:val="0"/>
+          <w:i w:val="0"/>
+        </w:rPr>
+        <w:t>Built an isolated git worktree per agent plus a review &amp; merge panel, so parallel agents never collide on the same checkout.</w:t>
+      </w:r>
+    </w:p>
+    <w:p>
+      <w:pPr>
+        <w:tabs>
+          <w:tab w:pos="255" w:val="left"/>
+        </w:tabs>
+        <w:spacing w:before="0" w:after="20"/>
+        <w:ind w:left="255" w:hanging="198"/>
+      </w:pPr>
+      <w:r>
+        <w:rPr>
+          <w:b w:val="0"/>
+          <w:i w:val="0"/>
+          <w:color w:val="1E4E8C"/>
+        </w:rPr>
+        <w:t>•</w:t>
+        <w:tab/>
+      </w:r>
+      <w:r>
+        <w:rPr>
+          <w:b w:val="0"/>
+          <w:i w:val="0"/>
+        </w:rPr>
+        <w:t>Integrated GitHub, Jira, Linear, Google Drive and LinkedIn plugins via MCP servers, along with local voice-to-text, routines, notes, layouts and a command palette.</w:t>
+      </w:r>
+    </w:p>
+    <w:p>
+      <w:pPr>
+        <w:tabs>
+          <w:tab w:pos="255" w:val="left"/>
+        </w:tabs>
+        <w:spacing w:before="0" w:after="20"/>
+        <w:ind w:left="255" w:hanging="198"/>
+      </w:pPr>
+      <w:r>
+        <w:rPr>
+          <w:b w:val="0"/>
+          <w:i w:val="0"/>
+          <w:color w:val="1E4E8C"/>
+        </w:rPr>
+        <w:t>•</w:t>
+        <w:tab/>
+      </w:r>
+      <w:r>
+        <w:rPr>
+          <w:b w:val="0"/>
+          <w:i w:val="0"/>
+        </w:rPr>
+        <w:t>Run CI release pipelines for Windows, macOS and Linux builds with built-in auto-update; currently at v0.39.</w:t>
+      </w:r>
+    </w:p>
+    <w:p>
+      <w:pPr>
+        <w:spacing w:before="0" w:after="20"/>
+        <w:ind w:left="255"/>
+      </w:pPr>
+      <w:r>
+        <w:rPr>
+          <w:b/>
+          <w:i w:val="0"/>
+          <w:color w:val="555D6B"/>
+          <w:sz w:val="19"/>
+        </w:rPr>
+        <w:t xml:space="preserve">Tech: </w:t>
+      </w:r>
+      <w:r>
+        <w:rPr>
+          <w:b w:val="0"/>
+          <w:i w:val="0"/>
+          <w:color w:val="555D6B"/>
+          <w:sz w:val="19"/>
+        </w:rPr>
+        <w:t>Python · PySide6 / Qt · Git worktrees · MCP · Whisper · GitHub Actions</w:t>
+      </w:r>
+    </w:p>
+    <w:p>
+      <w:pPr>
+        <w:keepNext/>
+        <w:tabs>
+          <w:tab w:pos="10091" w:val="right"/>
+        </w:tabs>
+        <w:spacing w:before="80" w:after="0"/>
+      </w:pPr>
+      <w:r>
+        <w:rPr>
+          <w:b/>
+          <w:i w:val="0"/>
+          <w:sz w:val="22"/>
+        </w:rPr>
+        <w:t>Full-Stack Developer — Freelance &amp; Client Work</w:t>
+      </w:r>
+      <w:r>
+        <w:rPr>
+          <w:b w:val="0"/>
+          <w:i w:val="0"/>
+          <w:color w:val="555D6B"/>
+          <w:sz w:val="19"/>
+        </w:rPr>
+        <w:tab/>
+        <w:t>2023 – Present</w:t>
+      </w:r>
+    </w:p>
+    <w:p>
+      <w:pPr>
+        <w:keepNext/>
+        <w:tabs>
+          <w:tab w:pos="10091" w:val="right"/>
+        </w:tabs>
+        <w:spacing w:before="0" w:after="20"/>
+      </w:pPr>
+      <w:r>
+        <w:rPr>
+          <w:b w:val="0"/>
+          <w:i/>
+          <w:color w:val="555D6B"/>
+          <w:sz w:val="20"/>
+        </w:rPr>
+        <w:t>E-commerce, SaaS &amp; business platforms</w:t>
+      </w:r>
+    </w:p>
+    <w:p>
+      <w:pPr>
+        <w:tabs>
+          <w:tab w:pos="255" w:val="left"/>
+        </w:tabs>
+        <w:spacing w:before="0" w:after="20"/>
+        <w:ind w:left="255" w:hanging="198"/>
+      </w:pPr>
+      <w:r>
+        <w:rPr>
+          <w:b w:val="0"/>
+          <w:i w:val="0"/>
+          <w:color w:val="1E4E8C"/>
+        </w:rPr>
+        <w:t>•</w:t>
+        <w:tab/>
+      </w:r>
+      <w:r>
+        <w:rPr>
+          <w:b w:val="0"/>
+          <w:i w:val="0"/>
+        </w:rPr>
+        <w:t>Built Dhaka Wholesale, a live e-commerce platform: Next.js 16 storefront plus a NestJS/Supabase API with an admin dashboard.</w:t>
+      </w:r>
+    </w:p>
+    <w:p>
+      <w:pPr>
+        <w:tabs>
+          <w:tab w:pos="255" w:val="left"/>
+        </w:tabs>
+        <w:spacing w:before="0" w:after="20"/>
+        <w:ind w:left="255" w:hanging="198"/>
+      </w:pPr>
+      <w:r>
+        <w:rPr>
+          <w:b w:val="0"/>
+          <w:i w:val="0"/>
+          <w:color w:val="1E4E8C"/>
+        </w:rPr>
+        <w:t>•</w:t>
+        <w:tab/>
+      </w:r>
+      <w:r>
+        <w:rPr>
+          <w:b w:val="0"/>
+          <w:i w:val="0"/>
+        </w:rPr>
+        <w:t>Built PostPilot, a multi-platform social-publishing SaaS, and the VibeFlow web platform with a client portal and admin tooling.</w:t>
+      </w:r>
+    </w:p>
+    <w:p>
+      <w:pPr>
+        <w:tabs>
+          <w:tab w:pos="255" w:val="left"/>
+        </w:tabs>
+        <w:spacing w:before="0" w:after="20"/>
+        <w:ind w:left="255" w:hanging="198"/>
+      </w:pPr>
+      <w:r>
+        <w:rPr>
+          <w:b w:val="0"/>
+          <w:i w:val="0"/>
+          <w:color w:val="1E4E8C"/>
+        </w:rPr>
+        <w:t>•</w:t>
+        <w:tab/>
+      </w:r>
+      <w:r>
+        <w:rPr>
+          <w:b w:val="0"/>
+          <w:i w:val="0"/>
+        </w:rPr>
+        <w:t>Delivered landing sites, dashboards and booking systems for small businesses, from requirements through deployment on Vercel.</w:t>
+      </w:r>
+    </w:p>
+    <w:p>
+      <w:pPr>
+        <w:spacing w:before="0" w:after="20"/>
+        <w:ind w:left="255"/>
+      </w:pPr>
+      <w:r>
+        <w:rPr>
+          <w:b/>
+          <w:i w:val="0"/>
+          <w:color w:val="555D6B"/>
+          <w:sz w:val="19"/>
+        </w:rPr>
+        <w:t xml:space="preserve">Tech: </w:t>
+      </w:r>
+      <w:r>
+        <w:rPr>
+          <w:b w:val="0"/>
+          <w:i w:val="0"/>
+          <w:color w:val="555D6B"/>
+          <w:sz w:val="19"/>
+        </w:rPr>
+        <w:t>Next.js · NestJS · TypeScript · Supabase · Vercel</w:t>
+      </w:r>
+    </w:p>
+    <w:p>
+      <w:pPr>
+        <w:keepNext/>
+        <w:spacing w:before="200" w:after="60"/>
+        <w:pBdr>
+          <w:bottom w:val="single" w:sz="6" w:space="1" w:color="1E4E8C"/>
+        </w:pBdr>
+      </w:pPr>
+      <w:r>
+        <w:rPr>
+          <w:b/>
+          <w:i w:val="0"/>
+          <w:color w:val="1E4E8C"/>
+          <w:sz w:val="22"/>
+        </w:rPr>
+        <w:t>HACKATHONS &amp; COMPETITIONS</w:t>
+      </w:r>
+    </w:p>
+    <w:p>
+      <w:pPr>
+        <w:keepNext/>
+        <w:tabs>
+          <w:tab w:pos="10091" w:val="right"/>
+        </w:tabs>
+        <w:spacing w:before="80" w:after="0"/>
+      </w:pPr>
+      <w:r>
+        <w:rPr>
+          <w:b/>
+          <w:i w:val="0"/>
+          <w:sz w:val="22"/>
+        </w:rPr>
+        <w:t>Hackathon Competitor</w:t>
+      </w:r>
+      <w:r>
+        <w:rPr>
+          <w:b w:val="0"/>
+          <w:i w:val="0"/>
+          <w:color w:val="555D6B"/>
+          <w:sz w:val="19"/>
+        </w:rPr>
+        <w:tab/>
+        <w:t>2024 – 2026</w:t>
+      </w:r>
+    </w:p>
+    <w:p>
+      <w:pPr>
+        <w:tabs>
+          <w:tab w:pos="255" w:val="left"/>
+        </w:tabs>
+        <w:spacing w:before="0" w:after="20"/>
+        <w:ind w:left="255" w:hanging="198"/>
+      </w:pPr>
+      <w:r>
+        <w:rPr>
+          <w:b w:val="0"/>
+          <w:i w:val="0"/>
+          <w:color w:val="1E4E8C"/>
+        </w:rPr>
+        <w:t>•</w:t>
+        <w:tab/>
+      </w:r>
+      <w:r>
+        <w:rPr>
+          <w:b/>
+          <w:i w:val="0"/>
+        </w:rPr>
+        <w:t xml:space="preserve">SUST CSE Carnival 2026 (Codex Community Hackathon): </w:t>
+      </w:r>
+      <w:r>
+        <w:rPr>
+          <w:b w:val="0"/>
+          <w:i w:val="0"/>
+        </w:rPr>
+        <w:t>QueueStorm Investigator — an AI/API SupportOps copilot for a digital-finance platform.</w:t>
+      </w:r>
+    </w:p>
+    <w:p>
+      <w:pPr>
+        <w:tabs>
+          <w:tab w:pos="255" w:val="left"/>
+        </w:tabs>
+        <w:spacing w:before="0" w:after="20"/>
+        <w:ind w:left="255" w:hanging="198"/>
+      </w:pPr>
+      <w:r>
+        <w:rPr>
+          <w:b w:val="0"/>
+          <w:i w:val="0"/>
+          <w:color w:val="1E4E8C"/>
+        </w:rPr>
+        <w:t>•</w:t>
+        <w:tab/>
+      </w:r>
+      <w:r>
+        <w:rPr>
+          <w:b/>
+          <w:i w:val="0"/>
+        </w:rPr>
+        <w:t xml:space="preserve">IUT Hackathon: </w:t>
+      </w:r>
+      <w:r>
+        <w:rPr>
+          <w:b w:val="0"/>
+          <w:i w:val="0"/>
+        </w:rPr>
+        <w:t>Office Energy Monitor — NestJS + Next.js system with anomaly detection and a Discord bot.</w:t>
+      </w:r>
+    </w:p>
+    <w:p>
+      <w:pPr>
+        <w:tabs>
+          <w:tab w:pos="255" w:val="left"/>
+        </w:tabs>
+        <w:spacing w:before="0" w:after="20"/>
+        <w:ind w:left="255" w:hanging="198"/>
+      </w:pPr>
+      <w:r>
+        <w:rPr>
+          <w:b w:val="0"/>
+          <w:i w:val="0"/>
+          <w:color w:val="1E4E8C"/>
+        </w:rPr>
+        <w:t>•</w:t>
+        <w:tab/>
+      </w:r>
+      <w:r>
+        <w:rPr>
+          <w:b/>
+          <w:i w:val="0"/>
+        </w:rPr>
+        <w:t xml:space="preserve">NSU Tech Fest: </w:t>
+      </w:r>
+      <w:r>
+        <w:rPr>
+          <w:b w:val="0"/>
+          <w:i w:val="0"/>
+        </w:rPr>
+        <w:t>Reached the second round with a full-stack solution.</w:t>
+      </w:r>
+    </w:p>
+    <w:p>
+      <w:pPr>
+        <w:keepNext/>
+        <w:tabs>
+          <w:tab w:pos="10091" w:val="right"/>
+        </w:tabs>
+        <w:spacing w:before="80" w:after="0"/>
+      </w:pPr>
+      <w:r>
+        <w:rPr>
+          <w:b/>
+          <w:i w:val="0"/>
+          <w:sz w:val="22"/>
+        </w:rPr>
+        <w:t>Robotics Competitor — National Robotics Championship (BUBT)</w:t>
+      </w:r>
+      <w:r>
+        <w:rPr>
+          <w:b w:val="0"/>
+          <w:i w:val="0"/>
+          <w:color w:val="555D6B"/>
+          <w:sz w:val="19"/>
+        </w:rPr>
+        <w:tab/>
+        <w:t>2024 – 2025</w:t>
+      </w:r>
+    </w:p>
+    <w:p>
+      <w:pPr>
+        <w:tabs>
+          <w:tab w:pos="255" w:val="left"/>
+        </w:tabs>
+        <w:spacing w:before="0" w:after="20"/>
+        <w:ind w:left="255" w:hanging="198"/>
+      </w:pPr>
+      <w:r>
+        <w:rPr>
+          <w:b w:val="0"/>
+          <w:i w:val="0"/>
+          <w:color w:val="1E4E8C"/>
+        </w:rPr>
+        <w:t>•</w:t>
+        <w:tab/>
+      </w:r>
+      <w:r>
+        <w:rPr>
+          <w:b w:val="0"/>
+          <w:i w:val="0"/>
+        </w:rPr>
+        <w:t>Built autonomous robots (line followers, soccer bots, drones) in C++ on Arduino and competed at national level.</w:t>
+      </w:r>
+    </w:p>
+    <w:p>
+      <w:pPr>
+        <w:keepNext/>
+        <w:spacing w:before="200" w:after="60"/>
+        <w:pBdr>
+          <w:bottom w:val="single" w:sz="6" w:space="1" w:color="1E4E8C"/>
+        </w:pBdr>
+      </w:pPr>
+      <w:r>
+        <w:rPr>
+          <w:b/>
+          <w:i w:val="0"/>
+          <w:color w:val="1E4E8C"/>
+          <w:sz w:val="22"/>
+        </w:rPr>
         <w:t>EDUCATION</w:t>
       </w:r>
     </w:p>
@@ -426,6 +969,31 @@
           <w:sz w:val="20"/>
         </w:rPr>
         <w:t>American International University-Bangladesh (AIUB), Dhaka</w:t>
+      </w:r>
+    </w:p>
+    <w:p>
+      <w:pPr>
+        <w:tabs>
+          <w:tab w:pos="255" w:val="left"/>
+        </w:tabs>
+        <w:spacing w:before="0" w:after="20"/>
+        <w:ind w:left="255" w:hanging="198"/>
+      </w:pPr>
+      <w:r>
+        <w:rPr>
+          <w:b w:val="0"/>
+          <w:i w:val="0"/>
+          <w:color w:val="1E4E8C"/>
+        </w:rPr>
+        <w:t>•</w:t>
+        <w:tab/>
+      </w:r>
+      <w:r>
+        <w:rPr>
+          <w:b w:val="0"/>
+          <w:i w:val="0"/>
+        </w:rPr>
+        <w:t>Coursework: mobile app development, advanced web technologies, software engineering. Final project: SOFOL, a farmer-credit fintech app.</w:t>
       </w:r>
     </w:p>
     <w:sectPr>

</xml_diff>

<commit_message>
docs(cv): add portfolio-aligned professional summary and technical skills
Summary now leads with shipped products (AgentDeck, Dhaka Wholesale,
PostPilot, SOFOL) instead of a generic fresher statement. Skills are grouped
to match the portfolio toolkit: languages, frontend, backend & data,
mobile & desktop, AI & ML, DevOps & tooling.

Co-Authored-By: Claude Opus 5.5 <noreply@anthropic.com>
</commit_message>
<xml_diff>
--- a/CV/Atik_Shahriar_CV.docx
+++ b/CV/Atik_Shahriar_CV.docx
@@ -157,6 +157,213 @@
           <w:t xml:space="preserve">vibeflow.tech</w:t>
         </w:r>
       </w:hyperlink>
+    </w:p>
+    <w:p>
+      <w:pPr>
+        <w:keepNext/>
+        <w:spacing w:before="200" w:after="60"/>
+        <w:pBdr>
+          <w:bottom w:val="single" w:sz="6" w:space="1" w:color="1E4E8C"/>
+        </w:pBdr>
+      </w:pPr>
+      <w:r>
+        <w:rPr>
+          <w:b/>
+          <w:i w:val="0"/>
+          <w:color w:val="1E4E8C"/>
+          <w:sz w:val="22"/>
+        </w:rPr>
+        <w:t>PROFESSIONAL SUMMARY</w:t>
+      </w:r>
+    </w:p>
+    <w:p>
+      <w:pPr>
+        <w:spacing w:before="0" w:after="20"/>
+        <w:jc w:val="both"/>
+      </w:pPr>
+      <w:r>
+        <w:rPr>
+          <w:b w:val="0"/>
+          <w:i w:val="0"/>
+        </w:rPr>
+        <w:t xml:space="preserve">Full-stack software engineer and CSE student at AIUB who takes products from an empty repo to production and keeps improving them after launch. Creator of </w:t>
+      </w:r>
+      <w:r>
+        <w:rPr>
+          <w:b/>
+          <w:i w:val="0"/>
+        </w:rPr>
+        <w:t>AgentDeck</w:t>
+      </w:r>
+      <w:r>
+        <w:rPr>
+          <w:b w:val="0"/>
+          <w:i w:val="0"/>
+        </w:rPr>
+        <w:t>, a cross-platform desktop workspace for AI coding agents shipping on Windows, macOS and Linux, and builder of a live wholesale e-commerce platform, an AI social-publishing SaaS and a fintech mobile app. Works mostly in TypeScript (Next.js, React, NestJS, Express, Supabase/PostgreSQL), with desktop apps in Python/Qt and mobile apps in React Native. 10+ live products and 55+ public repositories.</w:t>
+      </w:r>
+    </w:p>
+    <w:p>
+      <w:pPr>
+        <w:keepNext/>
+        <w:spacing w:before="200" w:after="60"/>
+        <w:pBdr>
+          <w:bottom w:val="single" w:sz="6" w:space="1" w:color="1E4E8C"/>
+        </w:pBdr>
+      </w:pPr>
+      <w:r>
+        <w:rPr>
+          <w:b/>
+          <w:i w:val="0"/>
+          <w:color w:val="1E4E8C"/>
+          <w:sz w:val="22"/>
+        </w:rPr>
+        <w:t>TECHNICAL SKILLS</w:t>
+      </w:r>
+    </w:p>
+    <w:p>
+      <w:pPr>
+        <w:tabs>
+          <w:tab w:pos="1871" w:val="left"/>
+        </w:tabs>
+        <w:spacing w:before="0" w:after="20"/>
+        <w:ind w:left="1871" w:hanging="1871"/>
+      </w:pPr>
+      <w:r>
+        <w:rPr>
+          <w:b/>
+          <w:i w:val="0"/>
+        </w:rPr>
+        <w:t>Languages:</w:t>
+      </w:r>
+      <w:r>
+        <w:rPr>
+          <w:b w:val="0"/>
+          <w:i w:val="0"/>
+        </w:rPr>
+        <w:tab/>
+        <w:t>TypeScript, JavaScript, Python, C++, C#, SQL, PHP</w:t>
+      </w:r>
+    </w:p>
+    <w:p>
+      <w:pPr>
+        <w:tabs>
+          <w:tab w:pos="1871" w:val="left"/>
+        </w:tabs>
+        <w:spacing w:before="0" w:after="20"/>
+        <w:ind w:left="1871" w:hanging="1871"/>
+      </w:pPr>
+      <w:r>
+        <w:rPr>
+          <w:b/>
+          <w:i w:val="0"/>
+        </w:rPr>
+        <w:t>Frontend:</w:t>
+      </w:r>
+      <w:r>
+        <w:rPr>
+          <w:b w:val="0"/>
+          <w:i w:val="0"/>
+        </w:rPr>
+        <w:tab/>
+        <w:t>React 19, Next.js 16, Tailwind CSS, Zustand, SWR, TanStack Query, Framer Motion</w:t>
+      </w:r>
+    </w:p>
+    <w:p>
+      <w:pPr>
+        <w:tabs>
+          <w:tab w:pos="1871" w:val="left"/>
+        </w:tabs>
+        <w:spacing w:before="0" w:after="20"/>
+        <w:ind w:left="1871" w:hanging="1871"/>
+      </w:pPr>
+      <w:r>
+        <w:rPr>
+          <w:b/>
+          <w:i w:val="0"/>
+        </w:rPr>
+        <w:t>Backend &amp; Data:</w:t>
+      </w:r>
+      <w:r>
+        <w:rPr>
+          <w:b w:val="0"/>
+          <w:i w:val="0"/>
+        </w:rPr>
+        <w:tab/>
+        <w:t>NestJS, Node.js / Express, Flask, Supabase, PostgreSQL, Firebase, REST APIs, JWT auth, Zod</w:t>
+      </w:r>
+    </w:p>
+    <w:p>
+      <w:pPr>
+        <w:tabs>
+          <w:tab w:pos="1871" w:val="left"/>
+        </w:tabs>
+        <w:spacing w:before="0" w:after="20"/>
+        <w:ind w:left="1871" w:hanging="1871"/>
+      </w:pPr>
+      <w:r>
+        <w:rPr>
+          <w:b/>
+          <w:i w:val="0"/>
+        </w:rPr>
+        <w:t>Mobile &amp; Desktop:</w:t>
+      </w:r>
+      <w:r>
+        <w:rPr>
+          <w:b w:val="0"/>
+          <w:i w:val="0"/>
+        </w:rPr>
+        <w:tab/>
+        <w:t>React Native, Expo, React Native Skia, Reanimated, Python + PySide6 (Qt), PyInstaller</w:t>
+      </w:r>
+    </w:p>
+    <w:p>
+      <w:pPr>
+        <w:tabs>
+          <w:tab w:pos="1871" w:val="left"/>
+        </w:tabs>
+        <w:spacing w:before="0" w:after="20"/>
+        <w:ind w:left="1871" w:hanging="1871"/>
+      </w:pPr>
+      <w:r>
+        <w:rPr>
+          <w:b/>
+          <w:i w:val="0"/>
+        </w:rPr>
+        <w:t>AI &amp; ML:</w:t>
+      </w:r>
+      <w:r>
+        <w:rPr>
+          <w:b w:val="0"/>
+          <w:i w:val="0"/>
+        </w:rPr>
+        <w:tab/>
+        <w:t>LLM APIs (Anthropic, OpenAI), MCP servers, Whisper speech-to-text, NLP, PyTorch, scikit-learn</w:t>
+      </w:r>
+    </w:p>
+    <w:p>
+      <w:pPr>
+        <w:tabs>
+          <w:tab w:pos="1871" w:val="left"/>
+        </w:tabs>
+        <w:spacing w:before="0" w:after="20"/>
+        <w:ind w:left="1871" w:hanging="1871"/>
+      </w:pPr>
+      <w:r>
+        <w:rPr>
+          <w:b/>
+          <w:i w:val="0"/>
+        </w:rPr>
+        <w:t>DevOps &amp; Tooling:</w:t>
+      </w:r>
+      <w:r>
+        <w:rPr>
+          <w:b w:val="0"/>
+          <w:i w:val="0"/>
+        </w:rPr>
+        <w:tab/>
+        <w:t>Git &amp; GitHub, GitHub Actions CI/CD, Vercel, Docker, Linux, Jest, Vitest</w:t>
+      </w:r>
     </w:p>
     <w:p>
       <w:pPr>

</xml_diff>

<commit_message>
docs(cv): tighten layout to two clean pages and set document metadata
Drop body text to 10pt and trim heading spacing so no project entry
splits across the page break; keep entry headings with their bullets.
Set title, subject and ATS keywords in the document properties.
Verified by rendering to PDF: 2 A4 pages, all hyperlinks resolve.

Co-Authored-By: Claude Opus 5.5 <noreply@anthropic.com>
</commit_message>
<xml_diff>
--- a/CV/Atik_Shahriar_CV.docx
+++ b/CV/Atik_Shahriar_CV.docx
@@ -161,7 +161,7 @@
     <w:p>
       <w:pPr>
         <w:keepNext/>
-        <w:spacing w:before="200" w:after="60"/>
+        <w:spacing w:before="180" w:after="60"/>
         <w:pBdr>
           <w:bottom w:val="single" w:sz="6" w:space="1" w:color="1E4E8C"/>
         </w:pBdr>
@@ -206,7 +206,7 @@
     <w:p>
       <w:pPr>
         <w:keepNext/>
-        <w:spacing w:before="200" w:after="60"/>
+        <w:spacing w:before="180" w:after="60"/>
         <w:pBdr>
           <w:bottom w:val="single" w:sz="6" w:space="1" w:color="1E4E8C"/>
         </w:pBdr>
@@ -368,7 +368,7 @@
     <w:p>
       <w:pPr>
         <w:keepNext/>
-        <w:spacing w:before="200" w:after="60"/>
+        <w:spacing w:before="180" w:after="60"/>
         <w:pBdr>
           <w:bottom w:val="single" w:sz="6" w:space="1" w:color="1E4E8C"/>
         </w:pBdr>
@@ -718,7 +718,7 @@
     <w:p>
       <w:pPr>
         <w:keepNext/>
-        <w:spacing w:before="200" w:after="60"/>
+        <w:spacing w:before="180" w:after="60"/>
         <w:pBdr>
           <w:bottom w:val="single" w:sz="6" w:space="1" w:color="1E4E8C"/>
         </w:pBdr>
@@ -1197,7 +1197,7 @@
     <w:p>
       <w:pPr>
         <w:keepNext/>
-        <w:spacing w:before="200" w:after="60"/>
+        <w:spacing w:before="180" w:after="60"/>
         <w:pBdr>
           <w:bottom w:val="single" w:sz="6" w:space="1" w:color="1E4E8C"/>
         </w:pBdr>
@@ -1390,7 +1390,7 @@
     <w:p>
       <w:pPr>
         <w:keepNext/>
-        <w:spacing w:before="200" w:after="60"/>
+        <w:spacing w:before="180" w:after="60"/>
         <w:pBdr>
           <w:bottom w:val="single" w:sz="6" w:space="1" w:color="1E4E8C"/>
         </w:pBdr>
@@ -1854,7 +1854,7 @@
     <w:rPr>
       <w:rFonts w:ascii="Calibri" w:hAnsi="Calibri" w:eastAsia="Calibri"/>
       <w:color w:val="1F232B"/>
-      <w:sz w:val="21"/>
+      <w:sz w:val="20"/>
     </w:rPr>
   </w:style>
   <w:style w:type="paragraph" w:styleId="Header">

</xml_diff>